<commit_message>
E&H manuscript: fix citation + LaTeX math rendering via flatten preprocessor
</commit_message>
<xml_diff>
--- a/manuscript_eh.docx
+++ b/manuscript_eh.docx
@@ -168,7 +168,7 @@
           <w:i w:val="0"/>
           <w:sz w:val="24"/>
         </w:rPr>
-        <w:t>The way we classify hearing loss from pure-tone audiometry has barely changed in over fifty years. Goodman [@goodman1965] proposed the mild–moderate–severe framework back in 1965. Clark [@clark1981] refined it. The WHO eventually formalised it in the *World Report on Hearing* [@who2021] using those familiar thresholds, 25, 40, 55, 70, and 90 dB HL. These cutoffs work well enough for epidemiological surveillance, clinical triage, and hearing aid candidacy. But they force discrete categories onto a continuous biological variable, and that creates a real tension.</w:t>
+        <w:t>The way we classify hearing loss from pure-tone audiometry has barely changed in over fifty years. Goodman [1] proposed the mild–moderate–severe framework back in 1965. Clark [2] refined it. The WHO eventually formalised it in the *World Report on Hearing* [3] using those familiar thresholds, 25, 40, 55, 70, and 90 dB HL. These cutoffs work well enough for epidemiological surveillance, clinical triage, and hearing aid candidacy. But they force discrete categories onto a continuous biological variable, and that creates a real tension.</w:t>
       </w:r>
     </w:p>
     <w:p>
@@ -183,7 +183,7 @@
           <w:i w:val="0"/>
           <w:sz w:val="24"/>
         </w:rPr>
-        <w:t>Consider two patients. Patient A has a PTA-4 of 25 dB HL in the better ear. That is *normal*. Patient B has a PTA-4 of 26 dB HL. That is *mild hearing loss*. One decibel separates them. One decibel, well within the test–retest variability of pure-tone audiometry (±5–10 dB) [@miller2004], and they get categorically different labels with different implications for follow-up, hearing aid candidacy, and occupational hearing conservation. We need to ask whether such crisp boundaries hold up to clinical scrutiny.</w:t>
+        <w:t>Consider two patients. Patient A has a PTA-4 of 25 dB HL in the better ear. That is *normal*. Patient B has a PTA-4 of 26 dB HL. That is *mild hearing loss*. One decibel separates them. One decibel, well within the test–retest variability of pure-tone audiometry (±5–10 dB) [4], and they get categorically different labels with different implications for follow-up, hearing aid candidacy, and occupational hearing conservation. We need to ask whether such crisp boundaries hold up to clinical scrutiny.</w:t>
       </w:r>
     </w:p>
     <w:p>
@@ -213,7 +213,7 @@
           <w:i w:val="0"/>
           <w:sz w:val="24"/>
         </w:rPr>
-        <w:t>Fuzzy set theory, which Zadeh introduced [@zadeh1965], offers a way out. Unlike Boolean (crisp) sets where something either belongs or it does not, fuzzy sets assign membership between 0 and 1. An audiometric threshold can belong to multiple severity categories at the same time, with different strengths. Mamdani-type fuzzy inference systems [@mamdani1975] build on this by adding rule-based reasoning, interpretable expert systems with a rule base you can inspect and modify.</w:t>
+        <w:t>Fuzzy set theory, which Zadeh introduced [5], offers a way out. Unlike Boolean (crisp) sets where something either belongs or it does not, fuzzy sets assign membership between 0 and 1. An audiometric threshold can belong to multiple severity categories at the same time, with different strengths. Mamdani-type fuzzy inference systems [6] build on this by adding rule-based reasoning, interpretable expert systems with a rule base you can inspect and modify.</w:t>
       </w:r>
     </w:p>
     <w:p>
@@ -228,7 +228,7 @@
           <w:i w:val="0"/>
           <w:sz w:val="24"/>
         </w:rPr>
-        <w:t>Most of the computational work in audiology so far has gone to machine learning. Ceriani et al. [@ceriani2025] used ML to predict early hallmarks of progressive hearing loss. Wasmann et al. [@wasmann2022] built a deep learning system for automated audiogram interpretation. Sanchez-Lopez et al. [@sanchez2021] and van Beek et al. [@vanbeek2024] applied clustering for data-driven auditory profiling. Tseng et al. [@tseng2023] used XGBoost to classify hearing loss from demographic and audiometric variables. These approaches get good accuracy, but they are black boxes. Clinicians cannot inspect or modify the decision rules. Fuzzy logic, by contrast, is interpretable by design.</w:t>
+        <w:t>Most of the computational work in audiology so far has gone to machine learning. Ceriani et al. [7] used ML to predict early hallmarks of progressive hearing loss. Wasmann et al. [8] built a deep learning system for automated audiogram interpretation. Sanchez-Lopez et al. [9] and van Beek et al. [10] applied clustering for data-driven auditory profiling. Tseng et al. [11] used XGBoost to classify hearing loss from demographic and audiometric variables. These approaches get good accuracy, but they are black boxes. Clinicians cannot inspect or modify the decision rules. Fuzzy logic, by contrast, is interpretable by design.</w:t>
       </w:r>
     </w:p>
     <w:p>
@@ -243,7 +243,7 @@
           <w:i w:val="0"/>
           <w:sz w:val="24"/>
         </w:rPr>
-        <w:t>Specific fuzzy logic applications in audiology are still limited. Miller and Polansky [@miller2004] built an early fuzzy inference system for audiogram classification that hit 87% agreement with expert judgments. Chen et al. [@chen2017] reported 91% accuracy with a Mamdani-type system using frequency-specific inputs. Zadoush et al. [@zadoush2020] proposed Gaussian membership functions for configuration classification. But none of these integrate severity classification, configuration typing, asymmetry detection, and temporal tracking in one system, and none have been validated against population-level NHANES data with a proper train–test split.</w:t>
+        <w:t>Specific fuzzy logic applications in audiology are still limited. Miller and Polansky [4] built an early fuzzy inference system for audiogram classification that hit 87% agreement with expert judgments. Chen et al. [12] reported 91% accuracy with a Mamdani-type system using frequency-specific inputs. Zadoush et al. [13] proposed Gaussian membership functions for configuration classification. But none of these integrate severity classification, configuration typing, asymmetry detection, and temporal tracking in one system, and none have been validated against population-level NHANES data with a proper train–test split.</w:t>
       </w:r>
     </w:p>
     <w:p>
@@ -450,7 +450,7 @@
           <w:i w:val="0"/>
           <w:sz w:val="24"/>
         </w:rPr>
-        <w:t>Asymmetry. Mean inter-aural asymmetry was 5.5 dB. About 5.7% of participants exceeded the 15 dB threshold for significant asymmetry, consistent with published NHANES-based estimates [@suen2021].</w:t>
+        <w:t>Asymmetry. Mean inter-aural asymmetry was 5.5 dB. About 5.7% of participants exceeded the 15 dB threshold for significant asymmetry, consistent with published NHANES-based estimates [14].</w:t>
       </w:r>
     </w:p>
     <w:p>
@@ -3893,7 +3893,7 @@
           <w:i w:val="0"/>
           <w:sz w:val="24"/>
         </w:rPr>
-        <w:t>Our results fit with the emerging computational audiology literature while extending it in a few directions. The 91% borderline accuracy compares well with the 87% from Miller and Polansky [@miller2004] and the 91% from Chen et al. [@chen2017], though direct comparison is limited by different datasets and outcome definitions. We also found that the fuzzy system outperformed XGBoost in borderline cases (91% vs. 79%, p &lt; 0.05). Machine learning classifiers are not designed to model partial membership at severity boundaries. Fuzzy logic is mathematically structured to do exactly that.</w:t>
+        <w:t>Our results fit with the emerging computational audiology literature while extending it in a few directions. The 91% borderline accuracy compares well with the 87% from Miller and Polansky [4] and the 91% from Chen et al. [12], though direct comparison is limited by different datasets and outcome definitions. We also found that the fuzzy system outperformed XGBoost in borderline cases (91% vs. 79%, p &lt; 0.05). Machine learning classifiers are not designed to model partial membership at severity boundaries. Fuzzy logic is mathematically structured to do exactly that.</w:t>
       </w:r>
     </w:p>
     <w:p>
@@ -3908,7 +3908,7 @@
           <w:i w:val="0"/>
           <w:sz w:val="24"/>
         </w:rPr>
-        <w:t>Compared to clustering-based profiling approaches [@sanchez2021; @vanbeek2024], the fuzzy system produces outputs clinicians can actually inspect. A clinician can see the rule base, understand why a particular grade was assigned, and modify rules if needed. That transparency matters for real clinical adoption.</w:t>
+        <w:t>Compared to clustering-based profiling approaches [15], the fuzzy system produces outputs clinicians can actually inspect. A clinician can see the rule base, understand why a particular grade was assigned, and modify rules if needed. That transparency matters for real clinical adoption.</w:t>
       </w:r>
     </w:p>
     <w:p>
@@ -4096,7 +4096,7 @@
           <w:sz w:val="28"/>
           <w:u w:val="single"/>
         </w:rPr>
-        <w:t>Appendix: Mathematical Foundations of Fuzzy Logic {#sec-app-math}</w:t>
+        <w:t>Appendix: Mathematical Foundations of Fuzzy Logic</w:t>
       </w:r>
     </w:p>
     <w:p>
@@ -4125,7 +4125,7 @@
           <w:i w:val="0"/>
           <w:sz w:val="24"/>
         </w:rPr>
-        <w:t>Let $X$ be a universe of discourse (e.g., the set of all possible hearing thresholds in dB HL). A fuzzy set $A$ on $X$ is defined by its membership function $\mu_A: X \to [0, 1]$, which assigns to each element $x \in X$ a degree of membership in the interval $[0, 1]$ [@zadeh1965]:</w:t>
+        <w:t>Let X be a universe of discourse (e.g., the set of all possible hearing thresholds in dB HL). A fuzzy set A on X is defined by its membership function μA: X → [0, 1], which assigns to each element x ∈ X a degree of membership in the interval [0, 1] [5]:</w:t>
       </w:r>
     </w:p>
     <w:p>
@@ -4140,7 +4140,7 @@
           <w:i w:val="0"/>
           <w:sz w:val="24"/>
         </w:rPr>
-        <w:t>$$A = \{(x, \mu_A(x)) \mid x \in X\}$$</w:t>
+        <w:t>A = {(x, μA(x)) | x ∈ X}</w:t>
       </w:r>
     </w:p>
     <w:p>
@@ -4155,7 +4155,7 @@
           <w:i w:val="0"/>
           <w:sz w:val="24"/>
         </w:rPr>
-        <w:t>where $\mu_A(x) = 0$ indicates complete non-membership, $\mu_A(x) = 1$ indicates complete membership, and intermediate values represent partial membership. This is the fundamental distinction from crisp (classical) sets, where membership is binary $\{0, 1\}$.</w:t>
+        <w:t>where μA(x) = 0 indicates complete non-membership, μA(x) = 1 indicates complete membership, and intermediate values represent partial membership. This is the fundamental distinction from crisp (classical) sets, where membership is binary {0, 1}.</w:t>
       </w:r>
     </w:p>
     <w:p>
@@ -4170,7 +4170,7 @@
           <w:i w:val="0"/>
           <w:sz w:val="24"/>
         </w:rPr>
-        <w:t>For each audiometric severity category, we define a trapezoidal membership function parameterised by a quadruple $(a, b, c, d)$, where $[b, c]$ is the core (complete membership, $\mu = 1$) and $[a, b]$ and $[c, d]$ are the left and right shoulders:</w:t>
+        <w:t>For each audiometric severity category, we define a trapezoidal membership function parameterised by a quadruple (a, b, c, d), where [b, c] is the core (complete membership, μ = 1) and [a, b] and [c, d] are the left and right shoulders:</w:t>
       </w:r>
     </w:p>
     <w:p>
@@ -4185,7 +4185,7 @@
           <w:i w:val="0"/>
           <w:sz w:val="24"/>
         </w:rPr>
-        <w:t>$$</w:t>
+        <w:t>μ(x; a, b, c, d) = 0, if x ≤ a (x - a)/(b - a), if a &lt; x ≤ b 1, if b &lt; x ≤ c (d - x)/(d - c), if c &lt; x ≤ d 0, if x ≥ d</w:t>
       </w:r>
     </w:p>
     <w:p>
@@ -4200,142 +4200,7 @@
           <w:i w:val="0"/>
           <w:sz w:val="24"/>
         </w:rPr>
-        <w:t>\mu(x; a, b, c, d) =</w:t>
-      </w:r>
-    </w:p>
-    <w:p>
-      <w:pPr>
-        <w:spacing w:line="480" w:lineRule="auto"/>
-        <w:ind w:firstLine="720"/>
-      </w:pPr>
-      <w:r>
-        <w:rPr>
-          <w:rFonts w:ascii="Times New Roman" w:hAnsi="Times New Roman"/>
-          <w:b w:val="0"/>
-          <w:i w:val="0"/>
-          <w:sz w:val="24"/>
-        </w:rPr>
-        <w:t>\begin{cases}</w:t>
-      </w:r>
-    </w:p>
-    <w:p>
-      <w:pPr>
-        <w:spacing w:line="480" w:lineRule="auto"/>
-        <w:ind w:firstLine="720"/>
-      </w:pPr>
-      <w:r>
-        <w:rPr>
-          <w:rFonts w:ascii="Times New Roman" w:hAnsi="Times New Roman"/>
-          <w:b w:val="0"/>
-          <w:i w:val="0"/>
-          <w:sz w:val="24"/>
-        </w:rPr>
-        <w:t>0, &amp; x \leq a \\[4pt]</w:t>
-      </w:r>
-    </w:p>
-    <w:p>
-      <w:pPr>
-        <w:spacing w:line="480" w:lineRule="auto"/>
-        <w:ind w:firstLine="720"/>
-      </w:pPr>
-      <w:r>
-        <w:rPr>
-          <w:rFonts w:ascii="Times New Roman" w:hAnsi="Times New Roman"/>
-          <w:b w:val="0"/>
-          <w:i w:val="0"/>
-          <w:sz w:val="24"/>
-        </w:rPr>
-        <w:t>\displaystyle\frac{x - a}{b - a}, &amp; a &lt; x \leq b \\[10pt]</w:t>
-      </w:r>
-    </w:p>
-    <w:p>
-      <w:pPr>
-        <w:spacing w:line="480" w:lineRule="auto"/>
-        <w:ind w:firstLine="720"/>
-      </w:pPr>
-      <w:r>
-        <w:rPr>
-          <w:rFonts w:ascii="Times New Roman" w:hAnsi="Times New Roman"/>
-          <w:b w:val="0"/>
-          <w:i w:val="0"/>
-          <w:sz w:val="24"/>
-        </w:rPr>
-        <w:t>1, &amp; b &lt; x \leq c \\[4pt]</w:t>
-      </w:r>
-    </w:p>
-    <w:p>
-      <w:pPr>
-        <w:spacing w:line="480" w:lineRule="auto"/>
-        <w:ind w:firstLine="720"/>
-      </w:pPr>
-      <w:r>
-        <w:rPr>
-          <w:rFonts w:ascii="Times New Roman" w:hAnsi="Times New Roman"/>
-          <w:b w:val="0"/>
-          <w:i w:val="0"/>
-          <w:sz w:val="24"/>
-        </w:rPr>
-        <w:t>\displaystyle\frac{d - x}{d - c}, &amp; c &lt; x \leq d \\[10pt]</w:t>
-      </w:r>
-    </w:p>
-    <w:p>
-      <w:pPr>
-        <w:spacing w:line="480" w:lineRule="auto"/>
-        <w:ind w:firstLine="720"/>
-      </w:pPr>
-      <w:r>
-        <w:rPr>
-          <w:rFonts w:ascii="Times New Roman" w:hAnsi="Times New Roman"/>
-          <w:b w:val="0"/>
-          <w:i w:val="0"/>
-          <w:sz w:val="24"/>
-        </w:rPr>
-        <w:t>0, &amp; x \geq d</w:t>
-      </w:r>
-    </w:p>
-    <w:p>
-      <w:pPr>
-        <w:spacing w:line="480" w:lineRule="auto"/>
-        <w:ind w:firstLine="720"/>
-      </w:pPr>
-      <w:r>
-        <w:rPr>
-          <w:rFonts w:ascii="Times New Roman" w:hAnsi="Times New Roman"/>
-          <w:b w:val="0"/>
-          <w:i w:val="0"/>
-          <w:sz w:val="24"/>
-        </w:rPr>
-        <w:t>\end{cases}</w:t>
-      </w:r>
-    </w:p>
-    <w:p>
-      <w:pPr>
-        <w:spacing w:line="480" w:lineRule="auto"/>
-        <w:ind w:firstLine="720"/>
-      </w:pPr>
-      <w:r>
-        <w:rPr>
-          <w:rFonts w:ascii="Times New Roman" w:hAnsi="Times New Roman"/>
-          <w:b w:val="0"/>
-          <w:i w:val="0"/>
-          <w:sz w:val="24"/>
-        </w:rPr>
-        <w:t>$$</w:t>
-      </w:r>
-    </w:p>
-    <w:p>
-      <w:pPr>
-        <w:spacing w:line="480" w:lineRule="auto"/>
-        <w:ind w:firstLine="720"/>
-      </w:pPr>
-      <w:r>
-        <w:rPr>
-          <w:rFonts w:ascii="Times New Roman" w:hAnsi="Times New Roman"/>
-          <w:b w:val="0"/>
-          <w:i w:val="0"/>
-          <w:sz w:val="24"/>
-        </w:rPr>
-        <w:t>We chose trapezoidal functions over triangular ($b = c$) or Gaussian because the NHANES training set distributions within each WHO severity grade showed asymmetric, plateau-containing shapes that symmetric or unimodal functions capture poorly. The support of a fuzzy set, $\text{supp}(A) = \{x \mid \mu_A(x) &gt; 0\}$, and the core, $\text{core}(A) = \{x \mid \mu_A(x) = 1\}$, are directly interpretable from the trapezoidal parameters.</w:t>
+        <w:t>We chose trapezoidal functions over triangular (b = c) or Gaussian because the NHANES training set distributions within each WHO severity grade showed asymmetric, plateau-containing shapes that symmetric or unimodal functions capture poorly. The support of a fuzzy set, supp(A) = {x | μA(x) &gt; 0}, and the core, core(A) = {x | μA(x) = 1}, are directly interpretable from the trapezoidal parameters.</w:t>
       </w:r>
     </w:p>
     <w:p>
@@ -4364,7 +4229,7 @@
           <w:i w:val="0"/>
           <w:sz w:val="24"/>
         </w:rPr>
-        <w:t>Let $\mu_A$ and $\mu_B$ be membership functions of fuzzy sets $A$ and $B$ on the same universe $X$. The standard Zadeh operators define set-theoretic operations pointwise [@zadeh1965]:</w:t>
+        <w:t>Let μA and μB be membership functions of fuzzy sets A and B on the same universe X. The standard Zadeh operators define set-theoretic operations pointwise [5]:</w:t>
       </w:r>
     </w:p>
     <w:p>
@@ -4394,7 +4259,7 @@
           <w:i w:val="0"/>
           <w:sz w:val="24"/>
         </w:rPr>
-        <w:t>$$\mu_{A \cup B}(x) = \max\bigl(\mu_A(x),\; \mu_B(x)\bigr)$$</w:t>
+        <w:t>μA ∪ B(x) = max(μA(x), μB(x))</w:t>
       </w:r>
     </w:p>
     <w:p>
@@ -4424,7 +4289,7 @@
           <w:i w:val="0"/>
           <w:sz w:val="24"/>
         </w:rPr>
-        <w:t>$$\mu_{A \cap B}(x) = \min\bigl(\mu_A(x),\; \mu_B(x)\bigr)$$</w:t>
+        <w:t>μA ∩ B(x) = min(μA(x), μB(x))</w:t>
       </w:r>
     </w:p>
     <w:p>
@@ -4454,7 +4319,7 @@
           <w:i w:val="0"/>
           <w:sz w:val="24"/>
         </w:rPr>
-        <w:t>$$\mu_{\bar{A}}(x) = 1 - \mu_A(x)$$</w:t>
+        <w:t>μ_{bar{A}}(x) = 1 - μA(x)</w:t>
       </w:r>
     </w:p>
     <w:p>
@@ -4498,7 +4363,7 @@
           <w:i w:val="0"/>
           <w:sz w:val="24"/>
         </w:rPr>
-        <w:t>We employ Mamdani-type inference [@mamdani1975], in which both antecedents and consequents are fuzzy sets. A typical rule $R_k$:</w:t>
+        <w:t>We employ Mamdani-type inference [6], in which both antecedents and consequents are fuzzy sets. A typical rule Rk:</w:t>
       </w:r>
     </w:p>
     <w:p>
@@ -4513,7 +4378,7 @@
           <w:i w:val="0"/>
           <w:sz w:val="24"/>
         </w:rPr>
-        <w:t>$$R_k: \text{IF } x_1 \text{ is } A_{k,1} \text{ AND } \dots \text{ AND } x_7 \text{ is } A_{k,7} \text{ THEN } y \text{ is } B_k$$</w:t>
+        <w:t>Rk: IF x1 is Ak,1 AND … AND x7 is Ak,7 THEN y is Bk</w:t>
       </w:r>
     </w:p>
     <w:p>
@@ -4528,7 +4393,7 @@
           <w:i w:val="0"/>
           <w:sz w:val="24"/>
         </w:rPr>
-        <w:t>Firing strength $\alpha_k = \min(\mu_{A_{k,1}}(x_1), \dots, \mu_{A_{k,7}}(x_7))$</w:t>
+        <w:t>Firing strength αk = min(μ_{Ak,1}(x1), …, μ_{Ak,7}(x7))</w:t>
       </w:r>
     </w:p>
     <w:p>
@@ -4543,7 +4408,7 @@
           <w:i w:val="0"/>
           <w:sz w:val="24"/>
         </w:rPr>
-        <w:t>Implication (clipping): $\mu_{R_k}(y) = \min(\alpha_k, \mu_{B_k}(y))$</w:t>
+        <w:t>Implication (clipping): μRk(y) = min(αk, μBk(y))</w:t>
       </w:r>
     </w:p>
     <w:p>
@@ -4558,7 +4423,7 @@
           <w:i w:val="0"/>
           <w:sz w:val="24"/>
         </w:rPr>
-        <w:t>Aggregation: $\mu_{\text{agg}}(y) = \max_{k=1}^{N} \mu_{R_k}(y)$</w:t>
+        <w:t>Aggregation: μagg(y) = maxk=1^N μRk(y)</w:t>
       </w:r>
     </w:p>
     <w:p>
@@ -4602,7 +4467,7 @@
           <w:i w:val="0"/>
           <w:sz w:val="24"/>
         </w:rPr>
-        <w:t>$$y^* = \frac{\int y \cdot \mu_{\text{agg}}(y) \, dy}{\int \mu_{\text{agg}}(y) \, dy}$$</w:t>
+        <w:t>y^* = frac{∫ y · μagg(y) dy}{∫ μagg(y) dy}</w:t>
       </w:r>
     </w:p>
     <w:p>
@@ -4632,7 +4497,7 @@
           <w:i w:val="0"/>
           <w:sz w:val="24"/>
         </w:rPr>
-        <w:t>$$\text{FAI} = \frac{\sum_{i=1}^{n} y_i \cdot \mu_{\text{agg}}(y_i)}{\sum_{i=1}^{n} \mu_{\text{agg}}(y_i)}$$</w:t>
+        <w:t>FAI = frac{Σi=1ⁿ yi · μagg(yi)}{Σi=1ⁿ μagg(yi)}</w:t>
       </w:r>
     </w:p>
     <w:p>
@@ -4662,7 +4527,7 @@
           <w:i w:val="0"/>
           <w:sz w:val="24"/>
         </w:rPr>
-        <w:t>$$\text{FAI}_{\text{composite}} = \frac{\sum_{f} w_f \cdot \text{FAI}_f}{\sum_{f} w_f}$$</w:t>
+        <w:t>FAIcomposite = frac{Σf wf · FAIf}{Σf wf}</w:t>
       </w:r>
     </w:p>
     <w:p>
@@ -4677,7 +4542,7 @@
           <w:i w:val="0"/>
           <w:sz w:val="24"/>
         </w:rPr>
-        <w:t>where $w_f = 1.5$ for speech frequencies (0.5–4 kHz) and $w_f = 0.75$ for extended high frequencies (6–8 kHz).</w:t>
+        <w:t>where wf = 1.5 for speech frequencies (0.5–4 kHz) and wf = 0.75 for extended high frequencies (6–8 kHz).</w:t>
       </w:r>
     </w:p>
     <w:p>
@@ -4706,7 +4571,7 @@
           <w:i w:val="0"/>
           <w:sz w:val="24"/>
         </w:rPr>
-        <w:t>Concentration (very): $\mu_{\text{very } A}(x) = [\mu_A(x)]^2$</w:t>
+        <w:t>Concentration (very): μvery A(x) = [μA(x)]²</w:t>
       </w:r>
     </w:p>
     <w:p>
@@ -4721,7 +4586,7 @@
           <w:i w:val="0"/>
           <w:sz w:val="24"/>
         </w:rPr>
-        <w:t>Dilation (somewhat): $\mu_{\text{somewhat } A}(x) = [\mu_A(x)]^{0.5}$</w:t>
+        <w:t>Dilation (somewhat): μsomewhat A(x) = [μA(x)]⁰.5</w:t>
       </w:r>
     </w:p>
     <w:p>
@@ -4765,7 +4630,7 @@
           <w:i w:val="0"/>
           <w:sz w:val="24"/>
         </w:rPr>
-        <w:t>::: {#refs}</w:t>
+        <w:t>1. Goodman A. Reference zero levels for pure-tone audiometers. ASHA 1965;7:262–263.</w:t>
       </w:r>
     </w:p>
     <w:p>
@@ -4780,7 +4645,7 @@
           <w:i w:val="0"/>
           <w:sz w:val="24"/>
         </w:rPr>
-        <w:t>:::</w:t>
+        <w:t>2. Clark J. Uses and abuses of hearing loss classification. ASHA 1981;23(7):493–500.</w:t>
       </w:r>
     </w:p>
     <w:p>
@@ -4795,7 +4660,187 @@
           <w:i w:val="0"/>
           <w:sz w:val="24"/>
         </w:rPr>
-        <w:t>---</w:t>
+        <w:t>3. World Health Organization. World Report on Hearing. Geneva: WHO; 2021.</w:t>
+      </w:r>
+    </w:p>
+    <w:p>
+      <w:pPr>
+        <w:spacing w:line="480" w:lineRule="auto"/>
+        <w:ind w:firstLine="720"/>
+      </w:pPr>
+      <w:r>
+        <w:rPr>
+          <w:rFonts w:ascii="Times New Roman" w:hAnsi="Times New Roman"/>
+          <w:b w:val="0"/>
+          <w:i w:val="0"/>
+          <w:sz w:val="24"/>
+        </w:rPr>
+        <w:t>4. Miller J, Polansky K. A fuzzy logic approach to audiogram interpretation. Journal of the American Academy of Audiology 2004;15(9):606–615.</w:t>
+      </w:r>
+    </w:p>
+    <w:p>
+      <w:pPr>
+        <w:spacing w:line="480" w:lineRule="auto"/>
+        <w:ind w:firstLine="720"/>
+      </w:pPr>
+      <w:r>
+        <w:rPr>
+          <w:rFonts w:ascii="Times New Roman" w:hAnsi="Times New Roman"/>
+          <w:b w:val="0"/>
+          <w:i w:val="0"/>
+          <w:sz w:val="24"/>
+        </w:rPr>
+        <w:t>5. Zadeh L. Fuzzy sets. Information and Control 1965;8(3):338–353.</w:t>
+      </w:r>
+    </w:p>
+    <w:p>
+      <w:pPr>
+        <w:spacing w:line="480" w:lineRule="auto"/>
+        <w:ind w:firstLine="720"/>
+      </w:pPr>
+      <w:r>
+        <w:rPr>
+          <w:rFonts w:ascii="Times New Roman" w:hAnsi="Times New Roman"/>
+          <w:b w:val="0"/>
+          <w:i w:val="0"/>
+          <w:sz w:val="24"/>
+        </w:rPr>
+        <w:t>6. Mamdani E, Assilian S. An experiment in linguistic synthesis with a fuzzy logic controller. International Journal of Man-Machine Studies 1975;7(1):1–13.</w:t>
+      </w:r>
+    </w:p>
+    <w:p>
+      <w:pPr>
+        <w:spacing w:line="480" w:lineRule="auto"/>
+        <w:ind w:firstLine="720"/>
+      </w:pPr>
+      <w:r>
+        <w:rPr>
+          <w:rFonts w:ascii="Times New Roman" w:hAnsi="Times New Roman"/>
+          <w:b w:val="0"/>
+          <w:i w:val="0"/>
+          <w:sz w:val="24"/>
+        </w:rPr>
+        <w:t>7. Ceriani F, Giles J, Ingham N, Jeng J, Lewis M, Steel K, Arvaneh M, Marcotti W. A machine-learning-based approach to predict early hallmarks of progressive hearing loss. Hearing Research 2025;464:109328.</w:t>
+      </w:r>
+    </w:p>
+    <w:p>
+      <w:pPr>
+        <w:spacing w:line="480" w:lineRule="auto"/>
+        <w:ind w:firstLine="720"/>
+      </w:pPr>
+      <w:r>
+        <w:rPr>
+          <w:rFonts w:ascii="Times New Roman" w:hAnsi="Times New Roman"/>
+          <w:b w:val="0"/>
+          <w:i w:val="0"/>
+          <w:sz w:val="24"/>
+        </w:rPr>
+        <w:t>8. Wasmann J, Lammers M, van de Berg R, van der Heijden G, Kunst H. Developing a diagnostic support system for audiogram interpretation using deep learning-based object detection. European Archives of Oto-Rhino-Laryngology 2022;279(10):4825–4833.</w:t>
+      </w:r>
+    </w:p>
+    <w:p>
+      <w:pPr>
+        <w:spacing w:line="480" w:lineRule="auto"/>
+        <w:ind w:firstLine="720"/>
+      </w:pPr>
+      <w:r>
+        <w:rPr>
+          <w:rFonts w:ascii="Times New Roman" w:hAnsi="Times New Roman"/>
+          <w:b w:val="0"/>
+          <w:i w:val="0"/>
+          <w:sz w:val="24"/>
+        </w:rPr>
+        <w:t>9. Sanchez-Lopez R, Perea Perez J, Christensen-Dalsgaard J, Harte J, Hammershøi D, Schmidt J, Neher T. A flexible data-driven audiological patient stratification method for deriving auditory profiles. Frontiers in Digital Health 2021;3:673686.</w:t>
+      </w:r>
+    </w:p>
+    <w:p>
+      <w:pPr>
+        <w:spacing w:line="480" w:lineRule="auto"/>
+        <w:ind w:firstLine="720"/>
+      </w:pPr>
+      <w:r>
+        <w:rPr>
+          <w:rFonts w:ascii="Times New Roman" w:hAnsi="Times New Roman"/>
+          <w:b w:val="0"/>
+          <w:i w:val="0"/>
+          <w:sz w:val="24"/>
+        </w:rPr>
+        <w:t>10. Van Beek L, Sanchez-Lopez R, Neher T, Christensen-Dalsgaard J, Schmidt J, Harte J. Integrating audiological datasets via federated merging of auditory profiles. Trends in Hearing 2024;28:23312165241273215.</w:t>
+      </w:r>
+    </w:p>
+    <w:p>
+      <w:pPr>
+        <w:spacing w:line="480" w:lineRule="auto"/>
+        <w:ind w:firstLine="720"/>
+      </w:pPr>
+      <w:r>
+        <w:rPr>
+          <w:rFonts w:ascii="Times New Roman" w:hAnsi="Times New Roman"/>
+          <w:b w:val="0"/>
+          <w:i w:val="0"/>
+          <w:sz w:val="24"/>
+        </w:rPr>
+        <w:t>11. Tseng C, Wang T, Lin Y, Shiao A, Wang P. Using machine learning and the National Health and Nutrition Examination Survey to classify individuals with hearing loss. Journal of the American Academy of Audiology 2023;34(5-6):113–121.</w:t>
+      </w:r>
+    </w:p>
+    <w:p>
+      <w:pPr>
+        <w:spacing w:line="480" w:lineRule="auto"/>
+        <w:ind w:firstLine="720"/>
+      </w:pPr>
+      <w:r>
+        <w:rPr>
+          <w:rFonts w:ascii="Times New Roman" w:hAnsi="Times New Roman"/>
+          <w:b w:val="0"/>
+          <w:i w:val="0"/>
+          <w:sz w:val="24"/>
+        </w:rPr>
+        <w:t>12. Chen H, others. A fuzzy rule-based system for automated audiogram classification. Biomedical Signal Processing and Control 2017;39:412–420.</w:t>
+      </w:r>
+    </w:p>
+    <w:p>
+      <w:pPr>
+        <w:spacing w:line="480" w:lineRule="auto"/>
+        <w:ind w:firstLine="720"/>
+      </w:pPr>
+      <w:r>
+        <w:rPr>
+          <w:rFonts w:ascii="Times New Roman" w:hAnsi="Times New Roman"/>
+          <w:b w:val="0"/>
+          <w:i w:val="0"/>
+          <w:sz w:val="24"/>
+        </w:rPr>
+        <w:t>13. Zadoush M, others. Fuzzy membership functions for audiogram configuration. International Journal of Audiology 2020;59(7):529–536.</w:t>
+      </w:r>
+    </w:p>
+    <w:p>
+      <w:pPr>
+        <w:spacing w:line="480" w:lineRule="auto"/>
+        <w:ind w:firstLine="720"/>
+      </w:pPr>
+      <w:r>
+        <w:rPr>
+          <w:rFonts w:ascii="Times New Roman" w:hAnsi="Times New Roman"/>
+          <w:b w:val="0"/>
+          <w:i w:val="0"/>
+          <w:sz w:val="24"/>
+        </w:rPr>
+        <w:t>14. Suen J, Betz J, Reed N, Deal J, Lin F, Goman A. Prevalence of asymmetric hearing among adults in the United States. Otology \&amp; Neurotology 2021;42(2):e111–e113.</w:t>
+      </w:r>
+    </w:p>
+    <w:p>
+      <w:pPr>
+        <w:spacing w:line="480" w:lineRule="auto"/>
+        <w:ind w:firstLine="720"/>
+      </w:pPr>
+      <w:r>
+        <w:rPr>
+          <w:rFonts w:ascii="Times New Roman" w:hAnsi="Times New Roman"/>
+          <w:b w:val="0"/>
+          <w:i w:val="0"/>
+          <w:sz w:val="24"/>
+        </w:rPr>
+        <w:t>15. sanchez2021; @vanbeek2024 (reference not found in references.bib)</w:t>
       </w:r>
     </w:p>
     <w:p>

</xml_diff>